<commit_message>
T6 : S1 V2 — lohateny avy amin'ny FRP 2026 (LFK 1a+1b) ; 1d → S2
- data_tsipelina_s1.py : LT/Lohahevitra/Fanovozan-kevitra = FRP T6 éd. oct. 2026 + RAPE herinandro 1-7 ; nesorina ny fifanoherana marina tsy mety (« teny mitovy fanonona = verindroa ») 4 toerana ; nalaina ny bloc LFK 1d (refs/_bloc_1d_telo_amin_S1.txt) hatao S2 ; LOHARANON-KEVITRA = plateforme.education.mg (FRP 2026 + RAPE) + ny 93p ho « réserve ».
- Build : output/Malagasy_T6_J-Learn.docx 75 088 o / 69 § / 3 tab. / 8 843 car. ; LISTE-ROUGE 21 fautes, 0 réapparition.
- run.sh : mamerina ho azy ny police Tinos (/home/user/police) sy fontTools (/home/user/pydeps) — very isaky ny rollback.

Co-authored-by: arena-agent <297053741+arena-agent@users.noreply.github.com>
</commit_message>
<xml_diff>
--- a/manuel-malagasy-t6/output/Malagasy_T6_J-Learn.docx
+++ b/manuel-malagasy-t6/output/Malagasy_T6_J-Learn.docx
@@ -137,7 +137,7 @@
             </w:pPr>
             <w:r/>
             <w:r>
-              <w:t>Lohahevitra : FIASAN'NY TENY - Tsipelina (PE T6 p.21)</w:t>
+              <w:t>Lohahevitra : FIASAN'NY TENY - Tsipelina (RAPE T6 herin. 1-7 · FRP LFK 1a-1b)</w:t>
             </w:r>
           </w:p>
         </w:tc>
@@ -167,7 +167,15 @@
             </w:pPr>
             <w:r/>
             <w:r>
-              <w:t>Lohateny : Teny verindroa</w:t>
+              <w:t>Lohateny : Teny mitovy fanonona fa samy hafa hevitra</w:t>
+            </w:r>
+          </w:p>
+          <w:p>
+            <w:pPr>
+              <w:spacing w:after="40" w:before="0"/>
+            </w:pPr>
+            <w:r>
+              <w:t>sy ny teny roa avahan'ny tendro</w:t>
             </w:r>
           </w:p>
         </w:tc>
@@ -241,7 +249,7 @@
             </w:pPr>
             <w:r/>
             <w:r>
-              <w:t>Fanovozan-kevitra : PE T6 p.21-22 · FRP 6ème p.74-75</w:t>
+              <w:t>Fanovozan-kevitra : FRP T6 éd. oct. 2026 (LFK 1a-1b) · RAPE T6 sept. 2026, herinandro 1→7 (coquille « Fanaambanan-teny ») · PE T6 p.21-22</w:t>
             </w:r>
           </w:p>
         </w:tc>
@@ -473,7 +481,7 @@
             </w:pPr>
             <w:r/>
             <w:r>
-              <w:t>V.A. : Teny verindroa. Ny litera na ny tendro no manavaka azy : « mianaka » sy « mihanaka ».</w:t>
+              <w:t>V.A. : Mitovy fanonona ireo fa samy hafa hevitra sy soratra — **tsy verindroa** (satria tsy naverina indroa ny teny iray). Ny litera na ny tendro no manavaka azy : « mianaka » sy « mihanaka ».</w:t>
             </w:r>
           </w:p>
         </w:tc>
@@ -654,7 +662,7 @@
             </w:pPr>
             <w:r/>
             <w:r>
-              <w:t>Lazao ny lohateny : « Fanoratana teny mitovy fanonona fa samy hafa hevitra » (FRP 6ème, p.74). Izany no atao androany hoe teny verindroa.</w:t>
+              <w:t>Lazao ny lohateny : « Fanoratana teny mitovy fanonona fa samy hafa hevitra » (FRP T6 éd. 2026, LFK 1a) sy « Teny roa avahan' ny tendro » (LFK 1b).</w:t>
             </w:r>
           </w:p>
           <w:p>
@@ -1324,7 +1332,9 @@
           <w:color w:val="FF00FF"/>
           <w:u w:val="single"/>
         </w:rPr>
-        <w:t>Teny verindroa</w:t>
+        <w:t>Teny mitovy fanonona fa samy hafa hevitra</w:t>
+        <w:br/>
+        <w:t>sy ny teny roa avahan'ny tendro</w:t>
       </w:r>
     </w:p>
     <w:p>
@@ -1368,7 +1378,7 @@
         <w:rPr>
           <w:color w:val="000000"/>
         </w:rPr>
-        <w:t xml:space="preserve"> ». Roa teny </w:t>
+        <w:t xml:space="preserve"> » (FRP T6 éd. 2026, LFK 1a) : roa teny </w:t>
       </w:r>
       <w:r>
         <w:rPr>
@@ -1396,21 +1406,7 @@
         <w:rPr>
           <w:color w:val="000000"/>
         </w:rPr>
-        <w:t xml:space="preserve"> no atao hoe </w:t>
-      </w:r>
-      <w:r>
-        <w:rPr>
-          <w:b/>
-          <w:i/>
-          <w:color w:val="F76995"/>
-        </w:rPr>
-        <w:t>teny verindroa</w:t>
-      </w:r>
-      <w:r>
-        <w:rPr>
-          <w:color w:val="000000"/>
-        </w:rPr>
-        <w:t xml:space="preserve"> : ny </w:t>
+        <w:t xml:space="preserve"> sy </w:t>
       </w:r>
       <w:r>
         <w:rPr>
@@ -1424,7 +1420,35 @@
         <w:rPr>
           <w:color w:val="000000"/>
         </w:rPr>
-        <w:t xml:space="preserve"> no manavaka azy.</w:t>
+        <w:t xml:space="preserve"> ; </w:t>
+      </w:r>
+      <w:r>
+        <w:rPr>
+          <w:b/>
+          <w:i/>
+          <w:color w:val="F76995"/>
+        </w:rPr>
+        <w:t>tsy</w:t>
+      </w:r>
+      <w:r>
+        <w:rPr>
+          <w:color w:val="000000"/>
+        </w:rPr>
+        <w:t xml:space="preserve"> atao hoe « teny verindroa » intsony, fa ny verindroa dia </w:t>
+      </w:r>
+      <w:r>
+        <w:rPr>
+          <w:b/>
+          <w:i/>
+          <w:color w:val="F76995"/>
+        </w:rPr>
+        <w:t>fiverenan'ny teny iray</w:t>
+      </w:r>
+      <w:r>
+        <w:rPr>
+          <w:color w:val="000000"/>
+        </w:rPr>
+        <w:t xml:space="preserve"> (lava → lavalava, LFK 1d = lesona manaraka) ; amin'ny teny frantsay : *homophones*.</w:t>
       </w:r>
     </w:p>
     <w:p>
@@ -2199,131 +2223,6 @@
     </w:p>
     <w:p>
       <w:pPr>
-        <w:keepNext/>
-        <w:numPr>
-          <w:ilvl w:val="0"/>
-          <w:numId w:val="100"/>
-        </w:numPr>
-        <w:spacing w:after="40" w:before="0"/>
-      </w:pPr>
-      <w:r>
-        <w:rPr>
-          <w:b/>
-          <w:color w:val="00B0F0"/>
-          <w:u w:val="single"/>
-        </w:rPr>
-        <w:t>Tanjony : manalefaka sy manamafy hevitra</w:t>
-      </w:r>
-    </w:p>
-    <w:p>
-      <w:pPr>
-        <w:spacing w:after="40" w:before="0"/>
-        <w:ind w:firstLine="360"/>
-      </w:pPr>
-      <w:r>
-        <w:rPr>
-          <w:color w:val="000000"/>
-        </w:rPr>
-        <w:t xml:space="preserve">Lanjan'ny fampiasana ny teny verindroa (PE T6, p.21) : mety </w:t>
-      </w:r>
-      <w:r>
-        <w:rPr>
-          <w:b/>
-          <w:i/>
-          <w:color w:val="F76995"/>
-        </w:rPr>
-        <w:t>manalefaka hevitra</w:t>
-      </w:r>
-      <w:r>
-        <w:rPr>
-          <w:color w:val="000000"/>
-        </w:rPr>
-        <w:t xml:space="preserve"> na </w:t>
-      </w:r>
-      <w:r>
-        <w:rPr>
-          <w:b/>
-          <w:i/>
-          <w:color w:val="F76995"/>
-        </w:rPr>
-        <w:t>manamafy hevitra</w:t>
-      </w:r>
-      <w:r>
-        <w:rPr>
-          <w:color w:val="000000"/>
-        </w:rPr>
-        <w:t xml:space="preserve"> ny fomba fampiasana azy. Hoy ny FRP (p.75), LFK 1d : « Tanjon' ny fampiasana teny verindroa ».</w:t>
-      </w:r>
-    </w:p>
-    <w:p>
-      <w:pPr>
-        <w:keepNext/>
-        <w:spacing w:after="40" w:before="0"/>
-        <w:ind w:firstLine="720"/>
-      </w:pPr>
-      <w:r>
-        <w:rPr>
-          <w:i/>
-          <w:color w:val="78B832"/>
-          <w:u w:val="single"/>
-        </w:rPr>
-        <w:t>Ohatra:</w:t>
-      </w:r>
-    </w:p>
-    <w:p>
-      <w:pPr>
-        <w:numPr>
-          <w:ilvl w:val="0"/>
-          <w:numId w:val="105"/>
-        </w:numPr>
-        <w:spacing w:after="40" w:before="0"/>
-      </w:pPr>
-      <w:r>
-        <w:rPr>
-          <w:b/>
-          <w:i/>
-          <w:color w:val="F76995"/>
-        </w:rPr>
-        <w:t>Manalefaka hevitra</w:t>
-      </w:r>
-      <w:r>
-        <w:t xml:space="preserve"> : Mihantahanta indray i Lita kely marina a !</w:t>
-      </w:r>
-    </w:p>
-    <w:p>
-      <w:pPr>
-        <w:numPr>
-          <w:ilvl w:val="0"/>
-          <w:numId w:val="105"/>
-        </w:numPr>
-        <w:spacing w:after="40" w:before="0"/>
-      </w:pPr>
-      <w:r>
-        <w:rPr>
-          <w:b/>
-          <w:i/>
-          <w:color w:val="F76995"/>
-        </w:rPr>
-        <w:t>Manamafy hevitra</w:t>
-      </w:r>
-      <w:r>
-        <w:t xml:space="preserve"> : Fepero ihany ny ankizy amin' ity tia mihaninkanika ity.</w:t>
-      </w:r>
-      <w:r>
-        <w:rPr>
-          <w:vertAlign w:val="superscript"/>
-        </w:rPr>
-        <w:footnoteReference w:id="1007"/>
-      </w:r>
-    </w:p>
-    <w:p>
-      <w:pPr>
-        <w:spacing w:after="40" w:before="0"/>
-        <w:ind w:left="2160"/>
-      </w:pPr>
-    </w:p>
-    <w:p>
-      <w:pPr>
         <w:spacing w:after="0"/>
       </w:pPr>
       <w:r>
@@ -2348,7 +2247,7 @@
         <w:keepNext/>
         <w:numPr>
           <w:ilvl w:val="0"/>
-          <w:numId w:val="106"/>
+          <w:numId w:val="105"/>
         </w:numPr>
         <w:spacing w:after="40" w:before="0"/>
       </w:pPr>
@@ -2560,7 +2459,7 @@
         <w:keepNext/>
         <w:numPr>
           <w:ilvl w:val="0"/>
-          <w:numId w:val="106"/>
+          <w:numId w:val="105"/>
         </w:numPr>
         <w:spacing w:after="40" w:before="0"/>
       </w:pPr>
@@ -2590,7 +2489,7 @@
         <w:keepNext/>
         <w:numPr>
           <w:ilvl w:val="0"/>
-          <w:numId w:val="106"/>
+          <w:numId w:val="105"/>
         </w:numPr>
         <w:spacing w:after="40" w:before="0"/>
       </w:pPr>
@@ -2621,7 +2520,7 @@
         <w:keepNext/>
         <w:numPr>
           <w:ilvl w:val="0"/>
-          <w:numId w:val="107"/>
+          <w:numId w:val="106"/>
         </w:numPr>
         <w:spacing w:after="40" w:before="0"/>
       </w:pPr>
@@ -2686,7 +2585,7 @@
         <w:keepNext/>
         <w:numPr>
           <w:ilvl w:val="0"/>
-          <w:numId w:val="107"/>
+          <w:numId w:val="106"/>
         </w:numPr>
         <w:spacing w:after="40" w:before="0"/>
       </w:pPr>
@@ -2762,7 +2661,7 @@
         <w:keepNext/>
         <w:numPr>
           <w:ilvl w:val="0"/>
-          <w:numId w:val="107"/>
+          <w:numId w:val="106"/>
         </w:numPr>
         <w:spacing w:after="40" w:before="0"/>
       </w:pPr>
@@ -2779,7 +2678,7 @@
           <w:i/>
           <w:color w:val="FF00FF"/>
         </w:rPr>
-        <w:t>Ny zava-dehibe : roa teny mitovy fanonona fa samy hafa hevitra, ka ny soratra (litera na tendro) no manavaka azy ; izay no atao hoe teny verindroa (FRP 6ème, p.74-75).</w:t>
+        <w:t>Ny zava-dehibe : roa teny mitovy fanonona fa samy hafa hevitra sy soratra (mianaka / mihanaka ; mazana / mazàna) ; tsy misy ifandraisany amin'ny teny verindroa — fiverenan'ny teny iray no atao hoe verindroa (lava / lavalava).</w:t>
       </w:r>
     </w:p>
     <w:p>
@@ -2812,7 +2711,34 @@
         <w:spacing w:after="40" w:before="0"/>
       </w:pPr>
       <w:r>
-        <w:t>- « Boky fanovozan-kevitra » 6ème, taranja Malagasy (FRP 6ème Malagasy), Minisiteran'ny Fanabeazam-pirenena — PDF « FRP_6eme_MLG.pdf », p.74-76 : TSIPELINA (Lesona) — LFK 1a « Fanoratana teny mitovy fanonona fa samy hafa hevitra », LFK 1b « Teny roa avahan' ny tendro », LFK 1d « Tanjon' ny fampiasana teny verindroa », LFK 1e « Fepetra amin' ny fanakambanan-teny » (lesona manaraka).</w:t>
+        <w:t xml:space="preserve">- FRP T6 — « FASCICULE DE RESSOURCES PÉDAGOGIQUES », taranja Malagasy, </w:t>
+      </w:r>
+      <w:r>
+        <w:rPr>
+          <w:b/>
+          <w:i/>
+          <w:color w:val="F76995"/>
+        </w:rPr>
+        <w:t>ÉDITION OCTOBRE 2026</w:t>
+      </w:r>
+      <w:r>
+        <w:t>, Minisiteran'ny Fanabeazam-pirenena : plateforme.education.mg → /bibliotheque-numerique/theme/biblio/pix/frp/college/FRP_T6/FRP_MLG_T6.pdf — LFK 1a « TSIPELINA / Fanoratana teny mitovy fanonona fa samy hafa hevitra » sy LFK 1b « TSIPELINA / Teny roa avahan' ny tendro » (mitovy votoaty amin'ny dikan-teny taloha, p.74-75).</w:t>
+      </w:r>
+    </w:p>
+    <w:p>
+      <w:pPr>
+        <w:spacing w:after="40" w:before="0"/>
+      </w:pPr>
+      <w:r>
+        <w:t>- RAPE T6, édisiona septambra 2026, plateforme.education.mg → /theme/biblio/pix/pdf/RAPE_T6.pdf : taranja Malagasy, p.6-7 — herinandro 1→33, andiany 5 (7-7-7-6-6), 4 ora/kerinandro ; « Fanaambanan-teny » = coquille amin'ny RAPE.</w:t>
+      </w:r>
+    </w:p>
+    <w:p>
+      <w:pPr>
+        <w:spacing w:after="40" w:before="0"/>
+      </w:pPr>
+      <w:r>
+        <w:t>- FRP 6ème Malagasy (soram-boaka taloha 93 pejy, « FRP_6eme_MLG.pdf »), p.74-76 : « réserve » an'ny lesona efa voasoratra feno (LFK 1a-1e) ; LFK 1d sy 1e = lesona manaraka (S2 sy S3).</w:t>
       </w:r>
     </w:p>
     <w:p>
@@ -2901,7 +2827,7 @@
         <w:rPr>
           <w:sz w:val="18"/>
         </w:rPr>
-        <w:t xml:space="preserve"> FRP 6ème Malagasy — PDF « FRP_6eme_MLG.pdf » (Minisiteran'ny Fanabeazam-pirenena : « boky fanovozan-kevitra » ho an'ny kilasy T1 hatramin'ny T9, HAFATRY NY MINISTERA, p.2 ; TSY voalaza ao amin'ny PDF ny fanambarana ny litera « FRP », ka tsy nohamboarina eto), p.74 (LFK 1a : Lesona, « TSIPELINA / Fanoratana teny mitovy fanonona fa samy hafa hevitra ») : ireo 8 fehezanteny ireo, voasoro teny-teny (« eran‟ny » = eran'ny, « amin‟ny » = amin'ny : ny guillemet-haut ao amin'ny PDF no novaina ho ' , tsy niovana ny teny).</w:t>
+        <w:t xml:space="preserve"> FRP 6ème Malagasy — PDF « FRP_6eme_MLG.pdf » (Minisiteran'ny Fanabeazam-pirenena : « boky fanovozan-kevitra » ho an'ny kilasy T1 hatramin'ny T9, HAFATRY NY MINISTERA, p.2 ; mitovy ny votoaty ; ary ny edisiona vaovao (Oktobra 2026) dia milaza fa « FASCICULE DE RESSOURCES PÉDAGOGIQUES (FRP) »), p.74 (LFK 1a : Lesona, « TSIPELINA / Fanoratana teny mitovy fanonona fa samy hafa hevitra ») : ireo 8 fehezanteny ireo, voasoro teny-teny (« eran‟ny » = eran'ny, « amin‟ny » = amin'ny : ny guillemet-haut ao amin'ny PDF no novaina ho ' , tsy niovana ny teny).</w:t>
       </w:r>
     </w:p>
   </w:footnote>
@@ -2982,26 +2908,6 @@
           <w:sz w:val="18"/>
         </w:rPr>
         <w:t xml:space="preserve"> FRP 6ème, p.74 (LFK 1b : Lesona, « TSIPELINA / Teny roa avahan' ny tendro ») : ireo dikany sy ohatra ireo, voasoro teny-teny.</w:t>
-      </w:r>
-    </w:p>
-  </w:footnote>
-  <w:footnote w:id="1007">
-    <w:p>
-      <w:pPr>
-        <w:spacing w:after="0" w:line="240" w:lineRule="auto"/>
-      </w:pPr>
-      <w:r>
-        <w:rPr>
-          <w:vertAlign w:val="superscript"/>
-          <w:sz w:val="18"/>
-        </w:rPr>
-        <w:footnoteRef/>
-      </w:r>
-      <w:r>
-        <w:rPr>
-          <w:sz w:val="18"/>
-        </w:rPr>
-        <w:t xml:space="preserve"> PE T6, PROGRAMME D'ETUDES, taranja Malagasy, p.21-22 (« FIASAN'NY TENY -Tsipelina » : « Votoatiny : Teny verindroa : lanjan' ny fampiasana ny teny verindroa - Manalefaka hevitra - Manamafy hevitra » ; « Faharetany : ora 12 » ; « Voka-pianarana manokana : Mifehy ny fitsipi-panoratana ny teny malagasy » ; « Fitaovana : Ampahan-dahatsoratra novakina na nohenoina ») sy FRP 6ème, p.75 (LFK 1d).</w:t>
       </w:r>
     </w:p>
   </w:footnote>
@@ -3244,21 +3150,10 @@
       <w:lvlText w:val="%1."/>
       <w:suff w:val="space"/>
       <w:lvlJc w:val="left"/>
-      <w:ind w:left="1080" w:hanging="360"/>
+      <w:ind w:left="360" w:hanging="360"/>
     </w:lvl>
   </w:abstractNum>
   <w:abstractNum w:abstractNumId="106">
-    <w:multiLevelType w:val="singleLevel"/>
-    <w:lvl w:ilvl="0">
-      <w:start w:val="1"/>
-      <w:numFmt w:val="decimal"/>
-      <w:lvlText w:val="%1."/>
-      <w:suff w:val="space"/>
-      <w:lvlJc w:val="left"/>
-      <w:ind w:left="360" w:hanging="360"/>
-    </w:lvl>
-  </w:abstractNum>
-  <w:abstractNum w:abstractNumId="107">
     <w:multiLevelType w:val="singleLevel"/>
     <w:lvl w:ilvl="0">
       <w:start w:val="1"/>
@@ -3316,9 +3211,6 @@
   </w:num>
   <w:num w:numId="106">
     <w:abstractNumId w:val="106"/>
-  </w:num>
-  <w:num w:numId="107">
-    <w:abstractNumId w:val="107"/>
   </w:num>
 </w:numbering>
 </file>

</xml_diff>

<commit_message>
T6 S3 : fanamboarana 4 tehozina ho an'ny aty-printy (je-hina → hodinihina ; mamerena → manazava ; ovany no atao → ny atao sy ny tsy atao ; V.A. « n » ampiana) Build : output/Malagasy_T6_J-Learn.docx 3 lesona (S1 V2, S2, S3) ; LISTE-ROUGE 0 rechute.
Co-authored-by: arena-agent <297053741+arena-agent@users.noreply.github.com>
</commit_message>
<xml_diff>
--- a/manuel-malagasy-t6/output/Malagasy_T6_J-Learn.docx
+++ b/manuel-malagasy-t6/output/Malagasy_T6_J-Learn.docx
@@ -6730,7 +6730,7 @@
               <w:spacing w:after="40" w:before="0"/>
             </w:pPr>
             <w:r>
-              <w:t>V.A. : indraindray dia tsy very ny -ka/-tra/-na fa miala ; ary ny « n » noampy — ny renifeo manaraka azy dia miova : s → ts, f → p, v → b, l → d.</w:t>
+              <w:t>V.A. : ny « n » no **ampiana** eo anelanelan'ny roa teny (*sary* → *sarin-*), ary ny renifeo voalohan'ny teny faharoa dia **miova** : s → ts, f → p, v → b, l → d.</w:t>
             </w:r>
           </w:p>
         </w:tc>
@@ -7275,7 +7275,7 @@
           <w:color w:val="00B0F0"/>
           <w:u w:val="single"/>
         </w:rPr>
-        <w:t>Ny zavatra je-hina (Votoatiny an'ny PE)</w:t>
+        <w:t>Ny zavatra hodinihina (Votoatiny an'ny PE)</w:t>
       </w:r>
     </w:p>
     <w:p>
@@ -7343,7 +7343,7 @@
         <w:rPr>
           <w:color w:val="000000"/>
         </w:rPr>
-        <w:t xml:space="preserve"> … ». *Mangina ny tapany farany* amin'ireo singa ireo ao amin'ny lahatsoratra ananantsika : nitohy hatramin'ny « na » ny andian-tsoratra, ka tsy nohamboarina eto. Ny ôhatra ao amin'ny FRP no mamerena azy : *trano (ananana) vorona (tompony)* → </w:t>
+        <w:t xml:space="preserve"> … ». *Mangina ny tapany farany* amin'ireo singa ireo ao amin'ny lahatsoratra ananantsika : nitohy hatramin'ny « na » ny andian-tsoratra, ka tsy nohamboarina eto. Ny ôhatra ao amin'ny FRP no manazava izany : *trano (ananana) vorona (tompony)* → </w:t>
       </w:r>
       <w:r>
         <w:rPr>
@@ -8005,7 +8005,7 @@
           <w:color w:val="00B0F0"/>
           <w:u w:val="single"/>
         </w:rPr>
-        <w:t>Fepetra : ovany no atao, ovany tsy atao</w:t>
+        <w:t>Fepetra : ny atao sy ny tsy atao</w:t>
       </w:r>
     </w:p>
     <w:p>

</xml_diff>

<commit_message>
T6 S2 : 4 teny voalamina (Nyaniana → Misy koa ; selule → tabilao ; minanana → nilaza ; mihehezany → tsy azo antoka) + refs/07 = tanoran'ny mpampianatra voatahiry teny-teny
Co-authored-by: arena-agent <297053741+arena-agent@users.noreply.github.com>
</commit_message>
<xml_diff>
--- a/manuel-malagasy-t6/output/Malagasy_T6_J-Learn.docx
+++ b/manuel-malagasy-t6/output/Malagasy_T6_J-Learn.docx
@@ -6391,7 +6391,7 @@
         <w:rPr>
           <w:color w:val="000000"/>
         </w:rPr>
-        <w:t xml:space="preserve">. Nyaniana amin'ny </w:t>
+        <w:t xml:space="preserve">. Misy koa amin'ny </w:t>
       </w:r>
       <w:r>
         <w:rPr>
@@ -6525,7 +6525,7 @@
         <w:rPr>
           <w:color w:val="000000"/>
         </w:rPr>
-        <w:t xml:space="preserve"> (voasoratra anaty honakona ny litera miova). Ny teny voalohany ao amin'ny selule rehetra dia ny </w:t>
+        <w:t xml:space="preserve"> (voasoratra anaty honakona ny litera miova). Ny teny voalohany ao amin'ny tabilao dia ny </w:t>
       </w:r>
       <w:r>
         <w:rPr>
@@ -10445,7 +10445,7 @@
           <w:i/>
           <w:color w:val="FF00FF"/>
         </w:rPr>
-        <w:t xml:space="preserve">Raha misy mihehezany : ilazao </w:t>
+        <w:t xml:space="preserve">Raha tsy azo antoka : ilazao </w:t>
       </w:r>
       <w:r>
         <w:rPr>
@@ -15074,7 +15074,7 @@
         <w:rPr>
           <w:sz w:val="18"/>
         </w:rPr>
-        <w:t xml:space="preserve"> Lanja fahatelo hita amin'ny fikarohana (mémoire UA 2014, §1.1.1.2) : ny verindroa dia mety **manova hevitra** tanteraka ny fototeny (*vanaka* → *vananaka*). **Tsy ampidirina** amin'ny leçon na amin'ny tombana izany ; ampiasao amin'ny fanazavana am-bava ihany, raha misy mpianatra manontany. Ny *Torolalana* 2015 kosa dia minanana hoe « **matetika** natao hanalefaka ny hevitra » ny verindroa : **ny FRP T6 no arahina** eto (roa tanjona), satria boky ho an'ny ambaratonga voalohany ilay *Torolalana*.</w:t>
+        <w:t xml:space="preserve"> Lanja fahatelo hita amin'ny fikarohana (mémoire UA 2014, §1.1.1.2) : ny verindroa dia mety **manova hevitra** tanteraka ny fototeny (*vanaka* → *vananaka*). **Tsy ampidirina** amin'ny leçon na amin'ny tombana izany ; ampiasao amin'ny fanazavana am-bava ihany, raha misy mpianatra manontany. Ny *Torolalana* 2015 kosa dia nilaza hoe « **matetika** natao hanalefaka ny hevitra » ny verindroa : **ny FRP T6 no arahina** eto (roa tanjona), satria boky ho an'ny ambaratonga voalohany ilay *Torolalana*.</w:t>
       </w:r>
     </w:p>
   </w:footnote>

</xml_diff>